<commit_message>
[UPDATE]: perbaikan template word S23
</commit_message>
<xml_diff>
--- a/public/word-template/surat_perintah_pembantaran_penahanan.docx
+++ b/public/word-template/surat_perintah_pembantaran_penahanan.docx
@@ -21,8 +21,8 @@
         <w:tblLook w:val="04A0" w:firstRow="1" w:lastRow="0" w:firstColumn="1" w:lastColumn="0" w:noHBand="0" w:noVBand="1"/>
       </w:tblPr>
       <w:tblGrid>
-        <w:gridCol w:w="5271"/>
-        <w:gridCol w:w="3844"/>
+        <w:gridCol w:w="5254"/>
+        <w:gridCol w:w="3861"/>
       </w:tblGrid>
       <w:tr>
         <w:trPr>
@@ -187,7 +187,7 @@
                 <w:szCs w:val="20"/>
               </w:rPr>
               <w:drawing>
-                <wp:inline distT="0" distB="0" distL="0" distR="0" wp14:anchorId="7944377A" wp14:editId="2591B9AC">
+                <wp:inline distT="0" distB="0" distL="0" distR="0" wp14:anchorId="7944377A" wp14:editId="1BAC1E13">
                   <wp:extent cx="738127" cy="690404"/>
                   <wp:effectExtent l="0" t="0" r="5080" b="0"/>
                   <wp:docPr id="6" name="Picture 6"/>
@@ -916,91 +916,7 @@
               <w:rPr>
                 <w:rFonts w:ascii="Arial Narrow" w:hAnsi="Arial Narrow"/>
               </w:rPr>
-              <w:t>}; (</w:t>
-            </w:r>
-            <w:proofErr w:type="spellStart"/>
-            <w:r>
-              <w:rPr>
-                <w:rFonts w:ascii="Arial Narrow" w:hAnsi="Arial Narrow"/>
-              </w:rPr>
-              <w:t>Perundang-undangan</w:t>
-            </w:r>
-            <w:proofErr w:type="spellEnd"/>
-            <w:r>
-              <w:rPr>
-                <w:rFonts w:ascii="Arial Narrow" w:hAnsi="Arial Narrow"/>
-              </w:rPr>
-              <w:t xml:space="preserve"> yang </w:t>
-            </w:r>
-            <w:proofErr w:type="spellStart"/>
-            <w:r>
-              <w:rPr>
-                <w:rFonts w:ascii="Arial Narrow" w:hAnsi="Arial Narrow"/>
-              </w:rPr>
-              <w:t>berkaitan</w:t>
-            </w:r>
-            <w:proofErr w:type="spellEnd"/>
-            <w:r>
-              <w:rPr>
-                <w:rFonts w:ascii="Arial Narrow" w:hAnsi="Arial Narrow"/>
-              </w:rPr>
-              <w:t xml:space="preserve"> </w:t>
-            </w:r>
-            <w:proofErr w:type="spellStart"/>
-            <w:r>
-              <w:rPr>
-                <w:rFonts w:ascii="Arial Narrow" w:hAnsi="Arial Narrow"/>
-              </w:rPr>
-              <w:t>dengan</w:t>
-            </w:r>
-            <w:proofErr w:type="spellEnd"/>
-            <w:r>
-              <w:rPr>
-                <w:rFonts w:ascii="Arial Narrow" w:hAnsi="Arial Narrow"/>
-              </w:rPr>
-              <w:t xml:space="preserve"> </w:t>
-            </w:r>
-            <w:proofErr w:type="spellStart"/>
-            <w:r>
-              <w:rPr>
-                <w:rFonts w:ascii="Arial Narrow" w:hAnsi="Arial Narrow"/>
-              </w:rPr>
-              <w:t>tindak</w:t>
-            </w:r>
-            <w:proofErr w:type="spellEnd"/>
-            <w:r>
-              <w:rPr>
-                <w:rFonts w:ascii="Arial Narrow" w:hAnsi="Arial Narrow"/>
-              </w:rPr>
-              <w:t xml:space="preserve"> </w:t>
-            </w:r>
-            <w:proofErr w:type="spellStart"/>
-            <w:r>
-              <w:rPr>
-                <w:rFonts w:ascii="Arial Narrow" w:hAnsi="Arial Narrow"/>
-              </w:rPr>
-              <w:t>pidana</w:t>
-            </w:r>
-            <w:proofErr w:type="spellEnd"/>
-            <w:r>
-              <w:rPr>
-                <w:rFonts w:ascii="Arial Narrow" w:hAnsi="Arial Narrow"/>
-              </w:rPr>
-              <w:t xml:space="preserve"> yang </w:t>
-            </w:r>
-            <w:proofErr w:type="spellStart"/>
-            <w:r>
-              <w:rPr>
-                <w:rFonts w:ascii="Arial Narrow" w:hAnsi="Arial Narrow"/>
-              </w:rPr>
-              <w:t>dipersangkakan</w:t>
-            </w:r>
-            <w:proofErr w:type="spellEnd"/>
-            <w:r>
-              <w:rPr>
-                <w:rFonts w:ascii="Arial Narrow" w:hAnsi="Arial Narrow"/>
-              </w:rPr>
-              <w:t>)</w:t>
+              <w:t xml:space="preserve">}; </w:t>
             </w:r>
           </w:p>
         </w:tc>
@@ -1246,7 +1162,13 @@
               <w:rPr>
                 <w:rFonts w:ascii="Arial Narrow" w:hAnsi="Arial Narrow"/>
               </w:rPr>
-              <w:t xml:space="preserve">} </w:t>
+              <w:t>}</w:t>
+            </w:r>
+            <w:r>
+              <w:rPr>
+                <w:rFonts w:ascii="Arial Narrow" w:hAnsi="Arial Narrow"/>
+              </w:rPr>
+              <w:t xml:space="preserve"> </w:t>
             </w:r>
             <w:proofErr w:type="spellStart"/>
             <w:r>
@@ -1428,7 +1350,13 @@
               <w:rPr>
                 <w:rFonts w:ascii="Arial Narrow" w:hAnsi="Arial Narrow"/>
               </w:rPr>
-              <w:t xml:space="preserve">} </w:t>
+              <w:t>}</w:t>
+            </w:r>
+            <w:r>
+              <w:rPr>
+                <w:rFonts w:ascii="Arial Narrow" w:hAnsi="Arial Narrow"/>
+              </w:rPr>
+              <w:t xml:space="preserve"> </w:t>
             </w:r>
             <w:proofErr w:type="spellStart"/>
             <w:r>
@@ -4185,6 +4113,7 @@
                 <w:b/>
                 <w:bCs/>
               </w:rPr>
+              <w:lastRenderedPageBreak/>
               <w:t>Yang Menerima Perintah</w:t>
             </w:r>
           </w:p>
@@ -4550,7 +4479,49 @@
               <w:rPr>
                 <w:rFonts w:ascii="Arial Narrow" w:hAnsi="Arial Narrow"/>
               </w:rPr>
-              <w:t xml:space="preserve"> Penahanan ini diserahkan kepada tersangka/kuasa hukum dan </w:t>
+              <w:t xml:space="preserve"> Penahanan ini diserahkan kepada </w:t>
+            </w:r>
+            <w:proofErr w:type="spellStart"/>
+            <w:r>
+              <w:rPr>
+                <w:rFonts w:ascii="Arial Narrow" w:hAnsi="Arial Narrow"/>
+              </w:rPr>
+              <w:t>tersangka</w:t>
+            </w:r>
+            <w:proofErr w:type="spellEnd"/>
+            <w:r>
+              <w:rPr>
+                <w:rFonts w:ascii="Arial Narrow" w:hAnsi="Arial Narrow"/>
+              </w:rPr>
+              <w:t>/</w:t>
+            </w:r>
+            <w:proofErr w:type="spellStart"/>
+            <w:r>
+              <w:rPr>
+                <w:rFonts w:ascii="Arial Narrow" w:hAnsi="Arial Narrow"/>
+              </w:rPr>
+              <w:t>kuasa</w:t>
+            </w:r>
+            <w:proofErr w:type="spellEnd"/>
+            <w:r>
+              <w:rPr>
+                <w:rFonts w:ascii="Arial Narrow" w:hAnsi="Arial Narrow"/>
+              </w:rPr>
+              <w:t xml:space="preserve"> </w:t>
+            </w:r>
+            <w:proofErr w:type="spellStart"/>
+            <w:r>
+              <w:rPr>
+                <w:rFonts w:ascii="Arial Narrow" w:hAnsi="Arial Narrow"/>
+              </w:rPr>
+              <w:t>hukum</w:t>
+            </w:r>
+            <w:proofErr w:type="spellEnd"/>
+            <w:r>
+              <w:rPr>
+                <w:rFonts w:ascii="Arial Narrow" w:hAnsi="Arial Narrow"/>
+              </w:rPr>
+              <w:t xml:space="preserve"> dan </w:t>
             </w:r>
             <w:proofErr w:type="spellStart"/>
             <w:r>

</xml_diff>